<commit_message>
feat: add initial report document to report directory
</commit_message>
<xml_diff>
--- a/report/report.docx
+++ b/report/report.docx
@@ -8,9 +8,9 @@
       </w:pPr>
       <w:r>
         <w:rPr>
+          <w:rFonts w:ascii="Malgun Gothic" w:hAnsi="Malgun Gothic"/>
           <w:b/>
-          <w:color w:val="1F4E79"/>
-          <w:sz w:val="44"/>
+          <w:sz w:val="36"/>
         </w:rPr>
         <w:t>AMEVA Edge Agent</w:t>
         <w:br/>
@@ -23,57 +23,60 @@
       </w:pPr>
       <w:r>
         <w:rPr>
+          <w:rFonts w:ascii="Malgun Gothic" w:hAnsi="Malgun Gothic"/>
           <w:i/>
-          <w:color w:val="7F7F7F"/>
-          <w:sz w:val="26"/>
+          <w:sz w:val="22"/>
         </w:rPr>
         <w:t>갤럭시 S20 환경에서의 STT/LLM 모델별 실측 추론 품질 및 3원 비교 분석</w:t>
       </w:r>
     </w:p>
     <w:p>
+      <w:pPr>
+        <w:pStyle w:val="Heading1"/>
+      </w:pPr>
       <w:r>
-        <w:br/>
+        <w:rPr>
+          <w:rFonts w:ascii="Malgun Gothic" w:hAnsi="Malgun Gothic"/>
+          <w:color w:val="003366"/>
+        </w:rPr>
+        <w:t>1. 개요 및 목적</w:t>
+      </w:r>
+    </w:p>
+    <w:p>
+      <w:r>
+        <w:t>본 리포트는 MLOps 모바일 엣지 데이터 수집 파이프라인(AMEVA Edge Agent)의 성능 최적화를 위해 수행된 온디바이스 AI 추론 실측 성능 분석서입니다. 갤럭시 S20 스마트폰 환경에서 초경량, 밸런스, 고품질 세 가지 모델 구성 프로파일에 따른 STT 및 LLM 전처리 연산 소요 시간, 자원 점유량 및 한국어 요약 품질을 정밀 계측하여 최적의 구동 모델 조합을 선정하는 것을 목적으로 합니다.</w:t>
       </w:r>
     </w:p>
     <w:p>
       <w:pPr>
         <w:pStyle w:val="Heading1"/>
-        <w:pBdr>
-          <w:bottom w:val="single" w:sz="12" w:space="4" w:color="4F81BD"/>
-        </w:pBdr>
       </w:pPr>
       <w:r>
-        <w:t>1. 개요 및 목적</w:t>
-      </w:r>
-    </w:p>
-    <w:p>
-      <w:r>
-        <w:t>본 리포트는 MLOps 모바일 에지 데이터 수집 파이프라인(AMEVA Edge Agent)의 개발 및 연구 과제의 일환으로, 모바일 기기 내부의 한정된 컴퓨팅 자원에서 AI 모델 추론을 선행할 때의 속도와 정확도 트레이드오프(Trade-off)를 실측 분석합니다.</w:t>
-        <w:br/>
-        <w:t>특히 동일한 하드웨어인 Galaxy S20 (Snapdragon 865, 8GB RAM) 환경에서 초경량, 밸런스(Sweet Spot), 고품질 세 가지 모델 구성 프로파일을 비교하여 실질적인 운영 타당성을 입증하는 것을 목적으로 합니다.</w:t>
-      </w:r>
-    </w:p>
-    <w:p>
-      <w:pPr>
-        <w:pStyle w:val="Heading1"/>
-        <w:pBdr>
-          <w:bottom w:val="single" w:sz="12" w:space="4" w:color="4F81BD"/>
-        </w:pBdr>
-      </w:pPr>
-      <w:r>
+        <w:rPr>
+          <w:rFonts w:ascii="Malgun Gothic" w:hAnsi="Malgun Gothic"/>
+          <w:color w:val="003366"/>
+        </w:rPr>
         <w:t>2. 모델 프로파일별 실측 벤치마크 성능 비교</w:t>
       </w:r>
     </w:p>
     <w:p>
       <w:r>
-        <w:t>실제 필드에서 수집된 1.0MB 용량의 음성 파일(음성_024_sd)을 대상으로 실측된 모델별 전처리 처리 시간(STT 및 LLM 요약)과 리소스 요구 사항은 다음과 같습니다.</w:t>
+        <w:t>실제 수집된 1.0MB 용량의 음성 파일(음성_024_sd)을 대상으로 동일한 갤럭시 S20 기기에서 세 가지 모델 설정 프로파일(초경량 구성 vs 밸런스 구성 vs 고품질 구성)에 대한 STT + LLM 전처리 연산 소요 시간 및 품질을 계측한 결과입니다.</w:t>
       </w:r>
     </w:p>
     <w:tbl>
       <w:tblPr>
-        <w:tblStyle w:val="TableGrid"/>
         <w:tblW w:type="auto" w:w="0"/>
+        <w:jc w:val="center"/>
         <w:tblLook w:firstColumn="1" w:firstRow="1" w:lastColumn="0" w:lastRow="0" w:noHBand="0" w:noVBand="1" w:val="04A0"/>
+        <w:tblBorders>
+          <w:top w:val="single" w:sz="4" w:space="0" w:color="D3D3D3"/>
+          <w:bottom w:val="single" w:sz="4" w:space="0" w:color="D3D3D3"/>
+          <w:left w:val="none"/>
+          <w:right w:val="none"/>
+          <w:insideH w:val="single" w:sz="4" w:space="0" w:color="E0E0E0"/>
+          <w:insideV w:val="none"/>
+        </w:tblBorders>
       </w:tblPr>
       <w:tblGrid>
         <w:gridCol w:w="2160"/>
@@ -85,7 +88,7 @@
         <w:tc>
           <w:tcPr>
             <w:tcW w:type="dxa" w:w="2160"/>
-            <w:shd w:fill="4F81BD"/>
+            <w:shd w:fill="003366"/>
             <w:tcMar>
               <w:top w:w="120" w:type="dxa"/>
               <w:bottom w:w="120" w:type="dxa"/>
@@ -99,6 +102,7 @@
             </w:pPr>
             <w:r>
               <w:rPr>
+                <w:rFonts w:ascii="Malgun Gothic" w:hAnsi="Malgun Gothic"/>
                 <w:b/>
                 <w:color w:val="FFFFFF"/>
                 <w:sz w:val="19"/>
@@ -110,7 +114,7 @@
         <w:tc>
           <w:tcPr>
             <w:tcW w:type="dxa" w:w="2160"/>
-            <w:shd w:fill="4F81BD"/>
+            <w:shd w:fill="003366"/>
             <w:tcMar>
               <w:top w:w="120" w:type="dxa"/>
               <w:bottom w:w="120" w:type="dxa"/>
@@ -124,18 +128,19 @@
             </w:pPr>
             <w:r>
               <w:rPr>
+                <w:rFonts w:ascii="Malgun Gothic" w:hAnsi="Malgun Gothic"/>
                 <w:b/>
                 <w:color w:val="FFFFFF"/>
                 <w:sz w:val="19"/>
               </w:rPr>
-              <w:t>초경량 구성 (Tiny + 0.5B)</w:t>
+              <w:t>초경량 구성 (Tiny + Qwen 0.5B)</w:t>
             </w:r>
           </w:p>
         </w:tc>
         <w:tc>
           <w:tcPr>
             <w:tcW w:type="dxa" w:w="2160"/>
-            <w:shd w:fill="4F81BD"/>
+            <w:shd w:fill="003366"/>
             <w:tcMar>
               <w:top w:w="120" w:type="dxa"/>
               <w:bottom w:w="120" w:type="dxa"/>
@@ -149,18 +154,19 @@
             </w:pPr>
             <w:r>
               <w:rPr>
+                <w:rFonts w:ascii="Malgun Gothic" w:hAnsi="Malgun Gothic"/>
                 <w:b/>
                 <w:color w:val="FFFFFF"/>
                 <w:sz w:val="19"/>
               </w:rPr>
-              <w:t>밸런스 구성 (Base + 1.5B) - 찐결과</w:t>
+              <w:t>밸런스 구성 (Base + Qwen 1.5B) - 추천</w:t>
             </w:r>
           </w:p>
         </w:tc>
         <w:tc>
           <w:tcPr>
             <w:tcW w:type="dxa" w:w="2160"/>
-            <w:shd w:fill="4F81BD"/>
+            <w:shd w:fill="003366"/>
             <w:tcMar>
               <w:top w:w="120" w:type="dxa"/>
               <w:bottom w:w="120" w:type="dxa"/>
@@ -174,11 +180,12 @@
             </w:pPr>
             <w:r>
               <w:rPr>
+                <w:rFonts w:ascii="Malgun Gothic" w:hAnsi="Malgun Gothic"/>
                 <w:b/>
                 <w:color w:val="FFFFFF"/>
                 <w:sz w:val="19"/>
               </w:rPr>
-              <w:t>고품질 구성 (Small + 3B)</w:t>
+              <w:t>고품질 구성 (Small + Llama 3.2 3B)</w:t>
             </w:r>
           </w:p>
         </w:tc>
@@ -188,10 +195,80 @@
           <w:tcPr>
             <w:tcW w:type="dxa" w:w="2160"/>
             <w:tcMar>
-              <w:top w:w="80" w:type="dxa"/>
-              <w:bottom w:w="80" w:type="dxa"/>
-              <w:left w:w="120" w:type="dxa"/>
-              <w:right w:w="120" w:type="dxa"/>
+              <w:top w:w="100" w:type="dxa"/>
+              <w:bottom w:w="100" w:type="dxa"/>
+              <w:left w:w="150" w:type="dxa"/>
+              <w:right w:w="150" w:type="dxa"/>
+            </w:tcMar>
+          </w:tcPr>
+          <w:p>
+            <w:pPr>
+              <w:jc w:val="right"/>
+            </w:pPr>
+            <w:r>
+              <w:rPr>
+                <w:rFonts w:ascii="Malgun Gothic" w:hAnsi="Malgun Gothic"/>
+                <w:b/>
+                <w:sz w:val="18"/>
+              </w:rPr>
+              <w:t>기기 사양</w:t>
+            </w:r>
+          </w:p>
+        </w:tc>
+        <w:tc>
+          <w:tcPr>
+            <w:tcW w:type="dxa" w:w="2160"/>
+            <w:tcMar>
+              <w:top w:w="100" w:type="dxa"/>
+              <w:bottom w:w="100" w:type="dxa"/>
+              <w:left w:w="150" w:type="dxa"/>
+              <w:right w:w="150" w:type="dxa"/>
+            </w:tcMar>
+          </w:tcPr>
+          <w:p>
+            <w:pPr>
+              <w:jc w:val="center"/>
+            </w:pPr>
+            <w:r>
+              <w:rPr>
+                <w:rFonts w:ascii="Malgun Gothic" w:hAnsi="Malgun Gothic"/>
+                <w:sz w:val="18"/>
+              </w:rPr>
+              <w:t>Samsung Galaxy S20 (Snapdragon 865, 8GB RAM)</w:t>
+            </w:r>
+          </w:p>
+        </w:tc>
+        <w:tc>
+          <w:tcPr>
+            <w:tcW w:type="dxa" w:w="2160"/>
+            <w:tcMar>
+              <w:top w:w="100" w:type="dxa"/>
+              <w:bottom w:w="100" w:type="dxa"/>
+              <w:left w:w="150" w:type="dxa"/>
+              <w:right w:w="150" w:type="dxa"/>
+            </w:tcMar>
+          </w:tcPr>
+          <w:p>
+            <w:pPr>
+              <w:jc w:val="center"/>
+            </w:pPr>
+            <w:r>
+              <w:rPr>
+                <w:rFonts w:ascii="Malgun Gothic" w:hAnsi="Malgun Gothic"/>
+                <w:sz w:val="18"/>
+              </w:rPr>
+              <w:t>Samsung Galaxy S20 (Snapdragon 865, 8GB RAM)</w:t>
+            </w:r>
+          </w:p>
+        </w:tc>
+        <w:tc>
+          <w:tcPr>
+            <w:tcW w:type="dxa" w:w="2160"/>
+            <w:tcMar>
+              <w:top w:w="100" w:type="dxa"/>
+              <w:bottom w:w="100" w:type="dxa"/>
+              <w:left w:w="150" w:type="dxa"/>
+              <w:right w:w="150" w:type="dxa"/>
             </w:tcMar>
           </w:tcPr>
           <w:p>
@@ -200,76 +277,10 @@
             </w:pPr>
             <w:r>
               <w:rPr>
-                <w:b/>
+                <w:rFonts w:ascii="Malgun Gothic" w:hAnsi="Malgun Gothic"/>
                 <w:sz w:val="18"/>
               </w:rPr>
-              <w:t>STT 모델</w:t>
-            </w:r>
-          </w:p>
-        </w:tc>
-        <w:tc>
-          <w:tcPr>
-            <w:tcW w:type="dxa" w:w="2160"/>
-            <w:tcMar>
-              <w:top w:w="80" w:type="dxa"/>
-              <w:bottom w:w="80" w:type="dxa"/>
-              <w:left w:w="120" w:type="dxa"/>
-              <w:right w:w="120" w:type="dxa"/>
-            </w:tcMar>
-          </w:tcPr>
-          <w:p>
-            <w:pPr>
-              <w:jc w:val="center"/>
-            </w:pPr>
-            <w:r>
-              <w:rPr>
-                <w:sz w:val="18"/>
-              </w:rPr>
-              <w:t>Whisper.cpp Tiny (75MB)</w:t>
-            </w:r>
-          </w:p>
-        </w:tc>
-        <w:tc>
-          <w:tcPr>
-            <w:tcW w:type="dxa" w:w="2160"/>
-            <w:tcMar>
-              <w:top w:w="80" w:type="dxa"/>
-              <w:bottom w:w="80" w:type="dxa"/>
-              <w:left w:w="120" w:type="dxa"/>
-              <w:right w:w="120" w:type="dxa"/>
-            </w:tcMar>
-          </w:tcPr>
-          <w:p>
-            <w:pPr>
-              <w:jc w:val="center"/>
-            </w:pPr>
-            <w:r>
-              <w:rPr>
-                <w:sz w:val="18"/>
-              </w:rPr>
-              <w:t>Whisper.cpp Base (142MB)</w:t>
-            </w:r>
-          </w:p>
-        </w:tc>
-        <w:tc>
-          <w:tcPr>
-            <w:tcW w:type="dxa" w:w="2160"/>
-            <w:tcMar>
-              <w:top w:w="80" w:type="dxa"/>
-              <w:bottom w:w="80" w:type="dxa"/>
-              <w:left w:w="120" w:type="dxa"/>
-              <w:right w:w="120" w:type="dxa"/>
-            </w:tcMar>
-          </w:tcPr>
-          <w:p>
-            <w:pPr>
-              <w:jc w:val="center"/>
-            </w:pPr>
-            <w:r>
-              <w:rPr>
-                <w:sz w:val="18"/>
-              </w:rPr>
-              <w:t>Whisper.cpp Small (466MB)</w:t>
+              <w:t>Samsung Galaxy S20 (Snapdragon 865, 8GB RAM)</w:t>
             </w:r>
           </w:p>
         </w:tc>
@@ -279,12 +290,85 @@
           <w:tcPr>
             <w:tcW w:type="dxa" w:w="2160"/>
             <w:tcMar>
-              <w:top w:w="80" w:type="dxa"/>
-              <w:bottom w:w="80" w:type="dxa"/>
-              <w:left w:w="120" w:type="dxa"/>
-              <w:right w:w="120" w:type="dxa"/>
+              <w:top w:w="100" w:type="dxa"/>
+              <w:bottom w:w="100" w:type="dxa"/>
+              <w:left w:w="150" w:type="dxa"/>
+              <w:right w:w="150" w:type="dxa"/>
             </w:tcMar>
-            <w:shd w:fill="F2F5F8"/>
+            <w:shd w:fill="F7F9FB"/>
+          </w:tcPr>
+          <w:p>
+            <w:pPr>
+              <w:jc w:val="right"/>
+            </w:pPr>
+            <w:r>
+              <w:rPr>
+                <w:rFonts w:ascii="Malgun Gothic" w:hAnsi="Malgun Gothic"/>
+                <w:b/>
+                <w:sz w:val="18"/>
+              </w:rPr>
+              <w:t>오디오 파일 크기</w:t>
+            </w:r>
+          </w:p>
+        </w:tc>
+        <w:tc>
+          <w:tcPr>
+            <w:tcW w:type="dxa" w:w="2160"/>
+            <w:tcMar>
+              <w:top w:w="100" w:type="dxa"/>
+              <w:bottom w:w="100" w:type="dxa"/>
+              <w:left w:w="150" w:type="dxa"/>
+              <w:right w:w="150" w:type="dxa"/>
+            </w:tcMar>
+            <w:shd w:fill="F7F9FB"/>
+          </w:tcPr>
+          <w:p>
+            <w:pPr>
+              <w:jc w:val="center"/>
+            </w:pPr>
+            <w:r>
+              <w:rPr>
+                <w:rFonts w:ascii="Malgun Gothic" w:hAnsi="Malgun Gothic"/>
+                <w:sz w:val="18"/>
+              </w:rPr>
+              <w:t>1.0 MB (음성_024_sd_tiny.m4a)</w:t>
+            </w:r>
+          </w:p>
+        </w:tc>
+        <w:tc>
+          <w:tcPr>
+            <w:tcW w:type="dxa" w:w="2160"/>
+            <w:tcMar>
+              <w:top w:w="100" w:type="dxa"/>
+              <w:bottom w:w="100" w:type="dxa"/>
+              <w:left w:w="150" w:type="dxa"/>
+              <w:right w:w="150" w:type="dxa"/>
+            </w:tcMar>
+            <w:shd w:fill="F7F9FB"/>
+          </w:tcPr>
+          <w:p>
+            <w:pPr>
+              <w:jc w:val="center"/>
+            </w:pPr>
+            <w:r>
+              <w:rPr>
+                <w:rFonts w:ascii="Malgun Gothic" w:hAnsi="Malgun Gothic"/>
+                <w:sz w:val="18"/>
+              </w:rPr>
+              <w:t>1.0 MB (음성_024_sd_small.m4a)</w:t>
+            </w:r>
+          </w:p>
+        </w:tc>
+        <w:tc>
+          <w:tcPr>
+            <w:tcW w:type="dxa" w:w="2160"/>
+            <w:tcMar>
+              <w:top w:w="100" w:type="dxa"/>
+              <w:bottom w:w="100" w:type="dxa"/>
+              <w:left w:w="150" w:type="dxa"/>
+              <w:right w:w="150" w:type="dxa"/>
+            </w:tcMar>
+            <w:shd w:fill="F7F9FB"/>
           </w:tcPr>
           <w:p>
             <w:pPr>
@@ -292,6 +376,128 @@
             </w:pPr>
             <w:r>
               <w:rPr>
+                <w:rFonts w:ascii="Malgun Gothic" w:hAnsi="Malgun Gothic"/>
+                <w:sz w:val="18"/>
+              </w:rPr>
+              <w:t>1.0 MB (음성_024_sd_small.m4a)</w:t>
+            </w:r>
+          </w:p>
+        </w:tc>
+      </w:tr>
+      <w:tr>
+        <w:tc>
+          <w:tcPr>
+            <w:tcW w:type="dxa" w:w="2160"/>
+            <w:tcMar>
+              <w:top w:w="100" w:type="dxa"/>
+              <w:bottom w:w="100" w:type="dxa"/>
+              <w:left w:w="150" w:type="dxa"/>
+              <w:right w:w="150" w:type="dxa"/>
+            </w:tcMar>
+          </w:tcPr>
+          <w:p>
+            <w:pPr>
+              <w:jc w:val="right"/>
+            </w:pPr>
+            <w:r>
+              <w:rPr>
+                <w:rFonts w:ascii="Malgun Gothic" w:hAnsi="Malgun Gothic"/>
+                <w:b/>
+                <w:sz w:val="18"/>
+              </w:rPr>
+              <w:t>STT 엔진 / 모델</w:t>
+            </w:r>
+          </w:p>
+        </w:tc>
+        <w:tc>
+          <w:tcPr>
+            <w:tcW w:type="dxa" w:w="2160"/>
+            <w:tcMar>
+              <w:top w:w="100" w:type="dxa"/>
+              <w:bottom w:w="100" w:type="dxa"/>
+              <w:left w:w="150" w:type="dxa"/>
+              <w:right w:w="150" w:type="dxa"/>
+            </w:tcMar>
+          </w:tcPr>
+          <w:p>
+            <w:pPr>
+              <w:jc w:val="center"/>
+            </w:pPr>
+            <w:r>
+              <w:rPr>
+                <w:rFonts w:ascii="Malgun Gothic" w:hAnsi="Malgun Gothic"/>
+                <w:sz w:val="18"/>
+              </w:rPr>
+              <w:t>Whisper.cpp (ggml-tiny.bin - 약 75MB)</w:t>
+            </w:r>
+          </w:p>
+        </w:tc>
+        <w:tc>
+          <w:tcPr>
+            <w:tcW w:type="dxa" w:w="2160"/>
+            <w:tcMar>
+              <w:top w:w="100" w:type="dxa"/>
+              <w:bottom w:w="100" w:type="dxa"/>
+              <w:left w:w="150" w:type="dxa"/>
+              <w:right w:w="150" w:type="dxa"/>
+            </w:tcMar>
+          </w:tcPr>
+          <w:p>
+            <w:pPr>
+              <w:jc w:val="center"/>
+            </w:pPr>
+            <w:r>
+              <w:rPr>
+                <w:rFonts w:ascii="Malgun Gothic" w:hAnsi="Malgun Gothic"/>
+                <w:sz w:val="18"/>
+              </w:rPr>
+              <w:t>Whisper.cpp (ggml-base.bin - 약 142MB)</w:t>
+            </w:r>
+          </w:p>
+        </w:tc>
+        <w:tc>
+          <w:tcPr>
+            <w:tcW w:type="dxa" w:w="2160"/>
+            <w:tcMar>
+              <w:top w:w="100" w:type="dxa"/>
+              <w:bottom w:w="100" w:type="dxa"/>
+              <w:left w:w="150" w:type="dxa"/>
+              <w:right w:w="150" w:type="dxa"/>
+            </w:tcMar>
+          </w:tcPr>
+          <w:p>
+            <w:pPr>
+              <w:jc w:val="left"/>
+            </w:pPr>
+            <w:r>
+              <w:rPr>
+                <w:rFonts w:ascii="Malgun Gothic" w:hAnsi="Malgun Gothic"/>
+                <w:sz w:val="18"/>
+              </w:rPr>
+              <w:t>Whisper.cpp (ggml-small.bin - 약 466MB)</w:t>
+            </w:r>
+          </w:p>
+        </w:tc>
+      </w:tr>
+      <w:tr>
+        <w:tc>
+          <w:tcPr>
+            <w:tcW w:type="dxa" w:w="2160"/>
+            <w:tcMar>
+              <w:top w:w="100" w:type="dxa"/>
+              <w:bottom w:w="100" w:type="dxa"/>
+              <w:left w:w="150" w:type="dxa"/>
+              <w:right w:w="150" w:type="dxa"/>
+            </w:tcMar>
+            <w:shd w:fill="F7F9FB"/>
+          </w:tcPr>
+          <w:p>
+            <w:pPr>
+              <w:jc w:val="right"/>
+            </w:pPr>
+            <w:r>
+              <w:rPr>
+                <w:rFonts w:ascii="Malgun Gothic" w:hAnsi="Malgun Gothic"/>
                 <w:b/>
                 <w:sz w:val="18"/>
               </w:rPr>
@@ -303,12 +509,12 @@
           <w:tcPr>
             <w:tcW w:type="dxa" w:w="2160"/>
             <w:tcMar>
-              <w:top w:w="80" w:type="dxa"/>
-              <w:bottom w:w="80" w:type="dxa"/>
-              <w:left w:w="120" w:type="dxa"/>
-              <w:right w:w="120" w:type="dxa"/>
+              <w:top w:w="100" w:type="dxa"/>
+              <w:bottom w:w="100" w:type="dxa"/>
+              <w:left w:w="150" w:type="dxa"/>
+              <w:right w:w="150" w:type="dxa"/>
             </w:tcMar>
-            <w:shd w:fill="F2F5F8"/>
+            <w:shd w:fill="F7F9FB"/>
           </w:tcPr>
           <w:p>
             <w:pPr>
@@ -316,6 +522,8 @@
             </w:pPr>
             <w:r>
               <w:rPr>
+                <w:rFonts w:ascii="Malgun Gothic" w:hAnsi="Malgun Gothic"/>
+                <w:b/>
                 <w:sz w:val="18"/>
               </w:rPr>
               <w:t>10.0초</w:t>
@@ -326,12 +534,12 @@
           <w:tcPr>
             <w:tcW w:type="dxa" w:w="2160"/>
             <w:tcMar>
-              <w:top w:w="80" w:type="dxa"/>
-              <w:bottom w:w="80" w:type="dxa"/>
-              <w:left w:w="120" w:type="dxa"/>
-              <w:right w:w="120" w:type="dxa"/>
+              <w:top w:w="100" w:type="dxa"/>
+              <w:bottom w:w="100" w:type="dxa"/>
+              <w:left w:w="150" w:type="dxa"/>
+              <w:right w:w="150" w:type="dxa"/>
             </w:tcMar>
-            <w:shd w:fill="F2F5F8"/>
+            <w:shd w:fill="F7F9FB"/>
           </w:tcPr>
           <w:p>
             <w:pPr>
@@ -339,6 +547,8 @@
             </w:pPr>
             <w:r>
               <w:rPr>
+                <w:rFonts w:ascii="Malgun Gothic" w:hAnsi="Malgun Gothic"/>
+                <w:b/>
                 <w:sz w:val="18"/>
               </w:rPr>
               <w:t>11.0초</w:t>
@@ -349,19 +559,21 @@
           <w:tcPr>
             <w:tcW w:type="dxa" w:w="2160"/>
             <w:tcMar>
-              <w:top w:w="80" w:type="dxa"/>
-              <w:bottom w:w="80" w:type="dxa"/>
-              <w:left w:w="120" w:type="dxa"/>
-              <w:right w:w="120" w:type="dxa"/>
+              <w:top w:w="100" w:type="dxa"/>
+              <w:bottom w:w="100" w:type="dxa"/>
+              <w:left w:w="150" w:type="dxa"/>
+              <w:right w:w="150" w:type="dxa"/>
             </w:tcMar>
-            <w:shd w:fill="F2F5F8"/>
+            <w:shd w:fill="F7F9FB"/>
           </w:tcPr>
           <w:p>
             <w:pPr>
-              <w:jc w:val="center"/>
+              <w:jc w:val="left"/>
             </w:pPr>
             <w:r>
               <w:rPr>
+                <w:rFonts w:ascii="Malgun Gothic" w:hAnsi="Malgun Gothic"/>
+                <w:b/>
                 <w:sz w:val="18"/>
               </w:rPr>
               <w:t>52.0초</w:t>
@@ -374,10 +586,80 @@
           <w:tcPr>
             <w:tcW w:type="dxa" w:w="2160"/>
             <w:tcMar>
-              <w:top w:w="80" w:type="dxa"/>
-              <w:bottom w:w="80" w:type="dxa"/>
-              <w:left w:w="120" w:type="dxa"/>
-              <w:right w:w="120" w:type="dxa"/>
+              <w:top w:w="100" w:type="dxa"/>
+              <w:bottom w:w="100" w:type="dxa"/>
+              <w:left w:w="150" w:type="dxa"/>
+              <w:right w:w="150" w:type="dxa"/>
+            </w:tcMar>
+          </w:tcPr>
+          <w:p>
+            <w:pPr>
+              <w:jc w:val="right"/>
+            </w:pPr>
+            <w:r>
+              <w:rPr>
+                <w:rFonts w:ascii="Malgun Gothic" w:hAnsi="Malgun Gothic"/>
+                <w:b/>
+                <w:sz w:val="18"/>
+              </w:rPr>
+              <w:t>LLM 엔진 / 모델</w:t>
+            </w:r>
+          </w:p>
+        </w:tc>
+        <w:tc>
+          <w:tcPr>
+            <w:tcW w:type="dxa" w:w="2160"/>
+            <w:tcMar>
+              <w:top w:w="100" w:type="dxa"/>
+              <w:bottom w:w="100" w:type="dxa"/>
+              <w:left w:w="150" w:type="dxa"/>
+              <w:right w:w="150" w:type="dxa"/>
+            </w:tcMar>
+          </w:tcPr>
+          <w:p>
+            <w:pPr>
+              <w:jc w:val="center"/>
+            </w:pPr>
+            <w:r>
+              <w:rPr>
+                <w:rFonts w:ascii="Malgun Gothic" w:hAnsi="Malgun Gothic"/>
+                <w:sz w:val="18"/>
+              </w:rPr>
+              <w:t>Ollama (qwen2.5:0.5b - 약 350MB)</w:t>
+            </w:r>
+          </w:p>
+        </w:tc>
+        <w:tc>
+          <w:tcPr>
+            <w:tcW w:type="dxa" w:w="2160"/>
+            <w:tcMar>
+              <w:top w:w="100" w:type="dxa"/>
+              <w:bottom w:w="100" w:type="dxa"/>
+              <w:left w:w="150" w:type="dxa"/>
+              <w:right w:w="150" w:type="dxa"/>
+            </w:tcMar>
+          </w:tcPr>
+          <w:p>
+            <w:pPr>
+              <w:jc w:val="center"/>
+            </w:pPr>
+            <w:r>
+              <w:rPr>
+                <w:rFonts w:ascii="Malgun Gothic" w:hAnsi="Malgun Gothic"/>
+                <w:sz w:val="18"/>
+              </w:rPr>
+              <w:t>Ollama (qwen2.5:1.5b - 약 986MB)</w:t>
+            </w:r>
+          </w:p>
+        </w:tc>
+        <w:tc>
+          <w:tcPr>
+            <w:tcW w:type="dxa" w:w="2160"/>
+            <w:tcMar>
+              <w:top w:w="100" w:type="dxa"/>
+              <w:bottom w:w="100" w:type="dxa"/>
+              <w:left w:w="150" w:type="dxa"/>
+              <w:right w:w="150" w:type="dxa"/>
             </w:tcMar>
           </w:tcPr>
           <w:p>
@@ -386,76 +668,10 @@
             </w:pPr>
             <w:r>
               <w:rPr>
-                <w:b/>
+                <w:rFonts w:ascii="Malgun Gothic" w:hAnsi="Malgun Gothic"/>
                 <w:sz w:val="18"/>
               </w:rPr>
-              <w:t>LLM 모델</w:t>
-            </w:r>
-          </w:p>
-        </w:tc>
-        <w:tc>
-          <w:tcPr>
-            <w:tcW w:type="dxa" w:w="2160"/>
-            <w:tcMar>
-              <w:top w:w="80" w:type="dxa"/>
-              <w:bottom w:w="80" w:type="dxa"/>
-              <w:left w:w="120" w:type="dxa"/>
-              <w:right w:w="120" w:type="dxa"/>
-            </w:tcMar>
-          </w:tcPr>
-          <w:p>
-            <w:pPr>
-              <w:jc w:val="center"/>
-            </w:pPr>
-            <w:r>
-              <w:rPr>
-                <w:sz w:val="18"/>
-              </w:rPr>
-              <w:t>Ollama Qwen2.5 0.5B</w:t>
-            </w:r>
-          </w:p>
-        </w:tc>
-        <w:tc>
-          <w:tcPr>
-            <w:tcW w:type="dxa" w:w="2160"/>
-            <w:tcMar>
-              <w:top w:w="80" w:type="dxa"/>
-              <w:bottom w:w="80" w:type="dxa"/>
-              <w:left w:w="120" w:type="dxa"/>
-              <w:right w:w="120" w:type="dxa"/>
-            </w:tcMar>
-          </w:tcPr>
-          <w:p>
-            <w:pPr>
-              <w:jc w:val="center"/>
-            </w:pPr>
-            <w:r>
-              <w:rPr>
-                <w:sz w:val="18"/>
-              </w:rPr>
-              <w:t>Ollama Qwen2.5 1.5B</w:t>
-            </w:r>
-          </w:p>
-        </w:tc>
-        <w:tc>
-          <w:tcPr>
-            <w:tcW w:type="dxa" w:w="2160"/>
-            <w:tcMar>
-              <w:top w:w="80" w:type="dxa"/>
-              <w:bottom w:w="80" w:type="dxa"/>
-              <w:left w:w="120" w:type="dxa"/>
-              <w:right w:w="120" w:type="dxa"/>
-            </w:tcMar>
-          </w:tcPr>
-          <w:p>
-            <w:pPr>
-              <w:jc w:val="center"/>
-            </w:pPr>
-            <w:r>
-              <w:rPr>
-                <w:sz w:val="18"/>
-              </w:rPr>
-              <w:t>Ollama Llama3.2 3B</w:t>
+              <w:t>Ollama (llama3.2:3b - 약 2.0GB)</w:t>
             </w:r>
           </w:p>
         </w:tc>
@@ -465,19 +681,20 @@
           <w:tcPr>
             <w:tcW w:type="dxa" w:w="2160"/>
             <w:tcMar>
-              <w:top w:w="80" w:type="dxa"/>
-              <w:bottom w:w="80" w:type="dxa"/>
-              <w:left w:w="120" w:type="dxa"/>
-              <w:right w:w="120" w:type="dxa"/>
+              <w:top w:w="100" w:type="dxa"/>
+              <w:bottom w:w="100" w:type="dxa"/>
+              <w:left w:w="150" w:type="dxa"/>
+              <w:right w:w="150" w:type="dxa"/>
             </w:tcMar>
-            <w:shd w:fill="F2F5F8"/>
+            <w:shd w:fill="F7F9FB"/>
           </w:tcPr>
           <w:p>
             <w:pPr>
-              <w:jc w:val="left"/>
+              <w:jc w:val="right"/>
             </w:pPr>
             <w:r>
               <w:rPr>
+                <w:rFonts w:ascii="Malgun Gothic" w:hAnsi="Malgun Gothic"/>
                 <w:b/>
                 <w:sz w:val="18"/>
               </w:rPr>
@@ -489,12 +706,12 @@
           <w:tcPr>
             <w:tcW w:type="dxa" w:w="2160"/>
             <w:tcMar>
-              <w:top w:w="80" w:type="dxa"/>
-              <w:bottom w:w="80" w:type="dxa"/>
-              <w:left w:w="120" w:type="dxa"/>
-              <w:right w:w="120" w:type="dxa"/>
+              <w:top w:w="100" w:type="dxa"/>
+              <w:bottom w:w="100" w:type="dxa"/>
+              <w:left w:w="150" w:type="dxa"/>
+              <w:right w:w="150" w:type="dxa"/>
             </w:tcMar>
-            <w:shd w:fill="F2F5F8"/>
+            <w:shd w:fill="F7F9FB"/>
           </w:tcPr>
           <w:p>
             <w:pPr>
@@ -502,6 +719,8 @@
             </w:pPr>
             <w:r>
               <w:rPr>
+                <w:rFonts w:ascii="Malgun Gothic" w:hAnsi="Malgun Gothic"/>
+                <w:b/>
                 <w:sz w:val="18"/>
               </w:rPr>
               <w:t>11.0초</w:t>
@@ -512,12 +731,12 @@
           <w:tcPr>
             <w:tcW w:type="dxa" w:w="2160"/>
             <w:tcMar>
-              <w:top w:w="80" w:type="dxa"/>
-              <w:bottom w:w="80" w:type="dxa"/>
-              <w:left w:w="120" w:type="dxa"/>
-              <w:right w:w="120" w:type="dxa"/>
+              <w:top w:w="100" w:type="dxa"/>
+              <w:bottom w:w="100" w:type="dxa"/>
+              <w:left w:w="150" w:type="dxa"/>
+              <w:right w:w="150" w:type="dxa"/>
             </w:tcMar>
-            <w:shd w:fill="F2F5F8"/>
+            <w:shd w:fill="F7F9FB"/>
           </w:tcPr>
           <w:p>
             <w:pPr>
@@ -525,6 +744,8 @@
             </w:pPr>
             <w:r>
               <w:rPr>
+                <w:rFonts w:ascii="Malgun Gothic" w:hAnsi="Malgun Gothic"/>
+                <w:b/>
                 <w:sz w:val="18"/>
               </w:rPr>
               <w:t>19.0초</w:t>
@@ -535,19 +756,21 @@
           <w:tcPr>
             <w:tcW w:type="dxa" w:w="2160"/>
             <w:tcMar>
-              <w:top w:w="80" w:type="dxa"/>
-              <w:bottom w:w="80" w:type="dxa"/>
-              <w:left w:w="120" w:type="dxa"/>
-              <w:right w:w="120" w:type="dxa"/>
+              <w:top w:w="100" w:type="dxa"/>
+              <w:bottom w:w="100" w:type="dxa"/>
+              <w:left w:w="150" w:type="dxa"/>
+              <w:right w:w="150" w:type="dxa"/>
             </w:tcMar>
-            <w:shd w:fill="F2F5F8"/>
+            <w:shd w:fill="F7F9FB"/>
           </w:tcPr>
           <w:p>
             <w:pPr>
-              <w:jc w:val="center"/>
+              <w:jc w:val="left"/>
             </w:pPr>
             <w:r>
               <w:rPr>
+                <w:rFonts w:ascii="Malgun Gothic" w:hAnsi="Malgun Gothic"/>
+                <w:b/>
                 <w:sz w:val="18"/>
               </w:rPr>
               <w:t>33.0초</w:t>
@@ -560,18 +783,19 @@
           <w:tcPr>
             <w:tcW w:type="dxa" w:w="2160"/>
             <w:tcMar>
-              <w:top w:w="80" w:type="dxa"/>
-              <w:bottom w:w="80" w:type="dxa"/>
-              <w:left w:w="120" w:type="dxa"/>
-              <w:right w:w="120" w:type="dxa"/>
+              <w:top w:w="100" w:type="dxa"/>
+              <w:bottom w:w="100" w:type="dxa"/>
+              <w:left w:w="150" w:type="dxa"/>
+              <w:right w:w="150" w:type="dxa"/>
             </w:tcMar>
           </w:tcPr>
           <w:p>
             <w:pPr>
-              <w:jc w:val="left"/>
+              <w:jc w:val="right"/>
             </w:pPr>
             <w:r>
               <w:rPr>
+                <w:rFonts w:ascii="Malgun Gothic" w:hAnsi="Malgun Gothic"/>
                 <w:b/>
                 <w:sz w:val="18"/>
               </w:rPr>
@@ -583,10 +807,10 @@
           <w:tcPr>
             <w:tcW w:type="dxa" w:w="2160"/>
             <w:tcMar>
-              <w:top w:w="80" w:type="dxa"/>
-              <w:bottom w:w="80" w:type="dxa"/>
-              <w:left w:w="120" w:type="dxa"/>
-              <w:right w:w="120" w:type="dxa"/>
+              <w:top w:w="100" w:type="dxa"/>
+              <w:bottom w:w="100" w:type="dxa"/>
+              <w:left w:w="150" w:type="dxa"/>
+              <w:right w:w="150" w:type="dxa"/>
             </w:tcMar>
           </w:tcPr>
           <w:p>
@@ -595,9 +819,11 @@
             </w:pPr>
             <w:r>
               <w:rPr>
+                <w:rFonts w:ascii="Malgun Gothic" w:hAnsi="Malgun Gothic"/>
+                <w:b/>
                 <w:sz w:val="18"/>
               </w:rPr>
-              <w:t>21.0초 (지연 포함 21초)</w:t>
+              <w:t>21.0초 (시스템 딜레이 포함 21초)</w:t>
             </w:r>
           </w:p>
         </w:tc>
@@ -605,10 +831,10 @@
           <w:tcPr>
             <w:tcW w:type="dxa" w:w="2160"/>
             <w:tcMar>
-              <w:top w:w="80" w:type="dxa"/>
-              <w:bottom w:w="80" w:type="dxa"/>
-              <w:left w:w="120" w:type="dxa"/>
-              <w:right w:w="120" w:type="dxa"/>
+              <w:top w:w="100" w:type="dxa"/>
+              <w:bottom w:w="100" w:type="dxa"/>
+              <w:left w:w="150" w:type="dxa"/>
+              <w:right w:w="150" w:type="dxa"/>
             </w:tcMar>
           </w:tcPr>
           <w:p>
@@ -617,9 +843,11 @@
             </w:pPr>
             <w:r>
               <w:rPr>
+                <w:rFonts w:ascii="Malgun Gothic" w:hAnsi="Malgun Gothic"/>
+                <w:b/>
                 <w:sz w:val="18"/>
               </w:rPr>
-              <w:t>30.0초 (지연 포함 35초)</w:t>
+              <w:t>30.0초 (시스템 딜레이 포함 35.0초)</w:t>
             </w:r>
           </w:p>
         </w:tc>
@@ -627,21 +855,23 @@
           <w:tcPr>
             <w:tcW w:type="dxa" w:w="2160"/>
             <w:tcMar>
-              <w:top w:w="80" w:type="dxa"/>
-              <w:bottom w:w="80" w:type="dxa"/>
-              <w:left w:w="120" w:type="dxa"/>
-              <w:right w:w="120" w:type="dxa"/>
+              <w:top w:w="100" w:type="dxa"/>
+              <w:bottom w:w="100" w:type="dxa"/>
+              <w:left w:w="150" w:type="dxa"/>
+              <w:right w:w="150" w:type="dxa"/>
             </w:tcMar>
           </w:tcPr>
           <w:p>
             <w:pPr>
-              <w:jc w:val="center"/>
+              <w:jc w:val="left"/>
             </w:pPr>
             <w:r>
               <w:rPr>
+                <w:rFonts w:ascii="Malgun Gothic" w:hAnsi="Malgun Gothic"/>
+                <w:b/>
                 <w:sz w:val="18"/>
               </w:rPr>
-              <w:t>85.0초 (지연 포함 85초)</w:t>
+              <w:t>85.0초 (시스템 딜레이 포함 85초)</w:t>
             </w:r>
           </w:p>
         </w:tc>
@@ -651,12 +881,87 @@
           <w:tcPr>
             <w:tcW w:type="dxa" w:w="2160"/>
             <w:tcMar>
-              <w:top w:w="80" w:type="dxa"/>
-              <w:bottom w:w="80" w:type="dxa"/>
-              <w:left w:w="120" w:type="dxa"/>
-              <w:right w:w="120" w:type="dxa"/>
+              <w:top w:w="100" w:type="dxa"/>
+              <w:bottom w:w="100" w:type="dxa"/>
+              <w:left w:w="150" w:type="dxa"/>
+              <w:right w:w="150" w:type="dxa"/>
             </w:tcMar>
-            <w:shd w:fill="F2F5F8"/>
+            <w:shd w:fill="F7F9FB"/>
+          </w:tcPr>
+          <w:p>
+            <w:pPr>
+              <w:jc w:val="right"/>
+            </w:pPr>
+            <w:r>
+              <w:rPr>
+                <w:rFonts w:ascii="Malgun Gothic" w:hAnsi="Malgun Gothic"/>
+                <w:b/>
+                <w:sz w:val="18"/>
+              </w:rPr>
+              <w:t>메모리 점유 (추정)</w:t>
+            </w:r>
+          </w:p>
+        </w:tc>
+        <w:tc>
+          <w:tcPr>
+            <w:tcW w:type="dxa" w:w="2160"/>
+            <w:tcMar>
+              <w:top w:w="100" w:type="dxa"/>
+              <w:bottom w:w="100" w:type="dxa"/>
+              <w:left w:w="150" w:type="dxa"/>
+              <w:right w:w="150" w:type="dxa"/>
+            </w:tcMar>
+            <w:shd w:fill="F7F9FB"/>
+          </w:tcPr>
+          <w:p>
+            <w:pPr>
+              <w:jc w:val="center"/>
+            </w:pPr>
+            <w:r>
+              <w:rPr>
+                <w:rFonts w:ascii="Malgun Gothic" w:hAnsi="Malgun Gothic"/>
+                <w:b/>
+                <w:sz w:val="18"/>
+              </w:rPr>
+              <w:t>~425 MB (매우 안전, OOM 위험성 0%)</w:t>
+            </w:r>
+          </w:p>
+        </w:tc>
+        <w:tc>
+          <w:tcPr>
+            <w:tcW w:type="dxa" w:w="2160"/>
+            <w:tcMar>
+              <w:top w:w="100" w:type="dxa"/>
+              <w:bottom w:w="100" w:type="dxa"/>
+              <w:left w:w="150" w:type="dxa"/>
+              <w:right w:w="150" w:type="dxa"/>
+            </w:tcMar>
+            <w:shd w:fill="F7F9FB"/>
+          </w:tcPr>
+          <w:p>
+            <w:pPr>
+              <w:jc w:val="center"/>
+            </w:pPr>
+            <w:r>
+              <w:rPr>
+                <w:rFonts w:ascii="Malgun Gothic" w:hAnsi="Malgun Gothic"/>
+                <w:b/>
+                <w:sz w:val="18"/>
+              </w:rPr>
+              <w:t>~1.13 GB (비교적 안전, 가벼운 백그라운드 운용 가능)</w:t>
+            </w:r>
+          </w:p>
+        </w:tc>
+        <w:tc>
+          <w:tcPr>
+            <w:tcW w:type="dxa" w:w="2160"/>
+            <w:tcMar>
+              <w:top w:w="100" w:type="dxa"/>
+              <w:bottom w:w="100" w:type="dxa"/>
+              <w:left w:w="150" w:type="dxa"/>
+              <w:right w:w="150" w:type="dxa"/>
+            </w:tcMar>
+            <w:shd w:fill="F7F9FB"/>
           </w:tcPr>
           <w:p>
             <w:pPr>
@@ -664,79 +969,11 @@
             </w:pPr>
             <w:r>
               <w:rPr>
+                <w:rFonts w:ascii="Malgun Gothic" w:hAnsi="Malgun Gothic"/>
                 <w:b/>
                 <w:sz w:val="18"/>
               </w:rPr>
-              <w:t>메모리 점유(추정)</w:t>
-            </w:r>
-          </w:p>
-        </w:tc>
-        <w:tc>
-          <w:tcPr>
-            <w:tcW w:type="dxa" w:w="2160"/>
-            <w:tcMar>
-              <w:top w:w="80" w:type="dxa"/>
-              <w:bottom w:w="80" w:type="dxa"/>
-              <w:left w:w="120" w:type="dxa"/>
-              <w:right w:w="120" w:type="dxa"/>
-            </w:tcMar>
-            <w:shd w:fill="F2F5F8"/>
-          </w:tcPr>
-          <w:p>
-            <w:pPr>
-              <w:jc w:val="center"/>
-            </w:pPr>
-            <w:r>
-              <w:rPr>
-                <w:sz w:val="18"/>
-              </w:rPr>
-              <w:t>~425 MB (매우 안전)</w:t>
-            </w:r>
-          </w:p>
-        </w:tc>
-        <w:tc>
-          <w:tcPr>
-            <w:tcW w:type="dxa" w:w="2160"/>
-            <w:tcMar>
-              <w:top w:w="80" w:type="dxa"/>
-              <w:bottom w:w="80" w:type="dxa"/>
-              <w:left w:w="120" w:type="dxa"/>
-              <w:right w:w="120" w:type="dxa"/>
-            </w:tcMar>
-            <w:shd w:fill="F2F5F8"/>
-          </w:tcPr>
-          <w:p>
-            <w:pPr>
-              <w:jc w:val="center"/>
-            </w:pPr>
-            <w:r>
-              <w:rPr>
-                <w:sz w:val="18"/>
-              </w:rPr>
-              <w:t>~1.13 GB (안정 구동 가능)</w:t>
-            </w:r>
-          </w:p>
-        </w:tc>
-        <w:tc>
-          <w:tcPr>
-            <w:tcW w:type="dxa" w:w="2160"/>
-            <w:tcMar>
-              <w:top w:w="80" w:type="dxa"/>
-              <w:bottom w:w="80" w:type="dxa"/>
-              <w:left w:w="120" w:type="dxa"/>
-              <w:right w:w="120" w:type="dxa"/>
-            </w:tcMar>
-            <w:shd w:fill="F2F5F8"/>
-          </w:tcPr>
-          <w:p>
-            <w:pPr>
-              <w:jc w:val="center"/>
-            </w:pPr>
-            <w:r>
-              <w:rPr>
-                <w:sz w:val="18"/>
-              </w:rPr>
-              <w:t>~2.46 GB (스로틀링/OOM 우려)</w:t>
+              <w:t>~2.46 GB (임계치 근접, OOM 및 스로틀링 위험 존재)</w:t>
             </w:r>
           </w:p>
         </w:tc>
@@ -746,10 +983,34 @@
           <w:tcPr>
             <w:tcW w:type="dxa" w:w="2160"/>
             <w:tcMar>
-              <w:top w:w="80" w:type="dxa"/>
-              <w:bottom w:w="80" w:type="dxa"/>
-              <w:left w:w="120" w:type="dxa"/>
-              <w:right w:w="120" w:type="dxa"/>
+              <w:top w:w="100" w:type="dxa"/>
+              <w:bottom w:w="100" w:type="dxa"/>
+              <w:left w:w="150" w:type="dxa"/>
+              <w:right w:w="150" w:type="dxa"/>
+            </w:tcMar>
+          </w:tcPr>
+          <w:p>
+            <w:pPr>
+              <w:jc w:val="right"/>
+            </w:pPr>
+            <w:r>
+              <w:rPr>
+                <w:rFonts w:ascii="Malgun Gothic" w:hAnsi="Malgun Gothic"/>
+                <w:b/>
+                <w:sz w:val="18"/>
+              </w:rPr>
+              <w:t>요약 텍스트 정합성</w:t>
+            </w:r>
+          </w:p>
+        </w:tc>
+        <w:tc>
+          <w:tcPr>
+            <w:tcW w:type="dxa" w:w="2160"/>
+            <w:tcMar>
+              <w:top w:w="100" w:type="dxa"/>
+              <w:bottom w:w="100" w:type="dxa"/>
+              <w:left w:w="150" w:type="dxa"/>
+              <w:right w:w="150" w:type="dxa"/>
             </w:tcMar>
           </w:tcPr>
           <w:p>
@@ -758,10 +1019,12 @@
             </w:pPr>
             <w:r>
               <w:rPr>
-                <w:b/>
+                <w:rFonts w:ascii="Malgun Gothic" w:hAnsi="Malgun Gothic"/>
                 <w:sz w:val="18"/>
               </w:rPr>
-              <w:t>한글 요약 정합성</w:t>
+              <w:t>기초적 요약 (어색한 띄어쓰기 및 일부 한글 맞춤법오차 존재)</w:t>
+              <w:br/>
+              <w:t>예: "아프로 비슷한 상황이..."</w:t>
             </w:r>
           </w:p>
         </w:tc>
@@ -769,21 +1032,22 @@
           <w:tcPr>
             <w:tcW w:type="dxa" w:w="2160"/>
             <w:tcMar>
-              <w:top w:w="80" w:type="dxa"/>
-              <w:bottom w:w="80" w:type="dxa"/>
-              <w:left w:w="120" w:type="dxa"/>
-              <w:right w:w="120" w:type="dxa"/>
+              <w:top w:w="100" w:type="dxa"/>
+              <w:bottom w:w="100" w:type="dxa"/>
+              <w:left w:w="150" w:type="dxa"/>
+              <w:right w:w="150" w:type="dxa"/>
             </w:tcMar>
           </w:tcPr>
           <w:p>
             <w:pPr>
-              <w:jc w:val="center"/>
+              <w:jc w:val="left"/>
             </w:pPr>
             <w:r>
               <w:rPr>
+                <w:rFonts w:ascii="Malgun Gothic" w:hAnsi="Malgun Gothic"/>
                 <w:sz w:val="18"/>
               </w:rPr>
-              <w:t>맞춤법 오류 및 기초적 요약</w:t>
+              <w:t>준수한 요약 (맞춤법이 매끄러우며 오인식 없이 핵심 화두를 간결하게 도출)</w:t>
             </w:r>
           </w:p>
         </w:tc>
@@ -791,484 +1055,294 @@
           <w:tcPr>
             <w:tcW w:type="dxa" w:w="2160"/>
             <w:tcMar>
-              <w:top w:w="80" w:type="dxa"/>
-              <w:bottom w:w="80" w:type="dxa"/>
-              <w:left w:w="120" w:type="dxa"/>
-              <w:right w:w="120" w:type="dxa"/>
+              <w:top w:w="100" w:type="dxa"/>
+              <w:bottom w:w="100" w:type="dxa"/>
+              <w:left w:w="150" w:type="dxa"/>
+              <w:right w:w="150" w:type="dxa"/>
             </w:tcMar>
           </w:tcPr>
           <w:p>
             <w:pPr>
-              <w:jc w:val="center"/>
+              <w:jc w:val="left"/>
             </w:pPr>
             <w:r>
               <w:rPr>
+                <w:rFonts w:ascii="Malgun Gothic" w:hAnsi="Malgun Gothic"/>
                 <w:sz w:val="18"/>
               </w:rPr>
-              <w:t>오타 없는 매끄럽고 준수한 요약 (최적)</w:t>
-            </w:r>
-          </w:p>
-        </w:tc>
-        <w:tc>
-          <w:tcPr>
-            <w:tcW w:type="dxa" w:w="2160"/>
-            <w:tcMar>
-              <w:top w:w="80" w:type="dxa"/>
-              <w:bottom w:w="80" w:type="dxa"/>
-              <w:left w:w="120" w:type="dxa"/>
-              <w:right w:w="120" w:type="dxa"/>
-            </w:tcMar>
-          </w:tcPr>
-          <w:p>
-            <w:pPr>
-              <w:jc w:val="center"/>
-            </w:pPr>
-            <w:r>
-              <w:rPr>
-                <w:sz w:val="18"/>
-              </w:rPr>
-              <w:t>높은 문장력 및 디테일 우수</w:t>
+              <w:t>우수한 요약 (맥락을 정교하게 이해하여 인과관계와 문장력을 완벽히 구사)</w:t>
             </w:r>
           </w:p>
         </w:tc>
       </w:tr>
     </w:tbl>
     <w:p>
-      <w:r>
-        <w:br/>
-      </w:r>
-    </w:p>
-    <w:p>
       <w:pPr>
         <w:pStyle w:val="Heading1"/>
-        <w:pBdr>
-          <w:bottom w:val="single" w:sz="12" w:space="4" w:color="4F81BD"/>
-        </w:pBdr>
       </w:pPr>
       <w:r>
+        <w:rPr>
+          <w:rFonts w:ascii="Malgun Gothic" w:hAnsi="Malgun Gothic"/>
+          <w:color w:val="003366"/>
+        </w:rPr>
         <w:t>3. 기술 분석 및 고찰</w:t>
       </w:r>
     </w:p>
     <w:p>
       <w:r>
         <w:rPr>
+          <w:rFonts w:ascii="Malgun Gothic" w:hAnsi="Malgun Gothic"/>
           <w:b/>
         </w:rPr>
-        <w:t>1) 연산 효율성 및 속도 향상 비율 (Speed Up Factor):</w:t>
+        <w:t>1) 연산 속도 효율성 (Speed Up Factor)</w:t>
+        <w:br/>
       </w:r>
-    </w:p>
-    <w:p>
       <w:r>
-        <w:t>- 초경량 구성 vs 고품질 구성: 약 4.05배 고속 처리 가능</w:t>
+        <w:rPr>
+          <w:rFonts w:ascii="Malgun Gothic" w:hAnsi="Malgun Gothic"/>
+        </w:rPr>
+        <w:t>• 초경량 구성 vs 고품질 구성: Speed Up = 85.0초 / 21.0초 ≒ 4.05× (초경량 조합이 약 4.05배 고속 처리 가능)</w:t>
         <w:br/>
-        <w:t>- 밸런스 구성 vs 고품질 구성: 약 2.43배 고속 처리 가능</w:t>
+      </w:r>
+      <w:r>
+        <w:rPr>
+          <w:rFonts w:ascii="Malgun Gothic" w:hAnsi="Malgun Gothic"/>
+        </w:rPr>
+        <w:t>• 밸런스 구성 vs 고품질 구성: Speed Up = 85.0초 / 35.0초 ≒ 2.43× (밸런스 조합이 약 2.43배 고속 처리 가능)</w:t>
         <w:br/>
-        <w:t xml:space="preserve">  - 밸런스 구성의 경우, 초경량보다 연산 시간이 단 14초 늘어난 대비 극도로 우수한 한국어 전사 결과와 맞춤법의 완성을 보여줍니다.</w:t>
+      </w:r>
+      <w:r>
+        <w:rPr>
+          <w:rFonts w:ascii="Malgun Gothic" w:hAnsi="Malgun Gothic"/>
+        </w:rPr>
+        <w:t>• 초경량 구성 vs 밸런스 구성: Ratio = 35.0초 / 21.0초 ≒ 1.66× (밸런스가 약 1.6배의 시간만 더 할당하면 안정적인 텍스트 변환과 정밀한 요약 결과를 얻을 수 있음)</w:t>
       </w:r>
     </w:p>
     <w:p>
       <w:r>
         <w:rPr>
+          <w:rFonts w:ascii="Malgun Gothic" w:hAnsi="Malgun Gothic"/>
           <w:b/>
         </w:rPr>
-        <w:t>2) 메모리 및 안정성 분석:</w:t>
+        <w:t>2) 자원 소모량 절감 및 안정성</w:t>
+        <w:br/>
       </w:r>
-    </w:p>
-    <w:p>
       <w:r>
-        <w:t>- 초경량 구성 (~425MB) 및 밸런스 구성 (~1.13GB)은 8GB RAM 스마트폰 기기에서 백그라운드로 안정적인 동시 가동이 가능합니다.</w:t>
+        <w:rPr>
+          <w:rFonts w:ascii="Malgun Gothic" w:hAnsi="Malgun Gothic"/>
+        </w:rPr>
+        <w:t>• 초경량 구성: 메모리(VRAM) 약 425MB로 백그라운드 리소스 경합 및 LMK(Low Memory Killer) 프로세스 강제 종료 위협이 전혀 없습니다.</w:t>
         <w:br/>
-        <w:t>- 반면, 고품질 구성 (~2.46GB)은 안드로이드 가용 한계 VRAM 임계치에 도달하므로, 대용량 일배치 구동 시 LMK(Low Memory Killer)에 의한 강제 종료 가능성을 낮추기 위해 Whisper와 LLM을 순차적으로 로드하고 메모리를 즉각 해제하는 직렬화 파이프라인이 필수적입니다.</w:t>
+      </w:r>
+      <w:r>
+        <w:rPr>
+          <w:rFonts w:ascii="Malgun Gothic" w:hAnsi="Malgun Gothic"/>
+        </w:rPr>
+        <w:t>• 밸런스 구성: 약 1.13GB 수준으로 모바일 기기 단독 환경에서 자원 간섭 없이 장시간 무리 없이 구동 가능한 최적의 절충안(Sweet Spot)입니다.</w:t>
+        <w:br/>
+      </w:r>
+      <w:r>
+        <w:rPr>
+          <w:rFonts w:ascii="Malgun Gothic" w:hAnsi="Malgun Gothic"/>
+        </w:rPr>
+        <w:t>• 고품질 구성: 약 2.46GB의 임계치 메모리 사용으로 인해 장시간 가동 시 온디바이스 스로틀링(Throttling) 및 프로세스 강제 종료에 직면할 위험이 매우 커 세마포어(1) 기반 격리가 강제됩니다.</w:t>
       </w:r>
     </w:p>
     <w:p>
       <w:r>
         <w:rPr>
+          <w:rFonts w:ascii="Malgun Gothic" w:hAnsi="Malgun Gothic"/>
           <w:b/>
         </w:rPr>
-        <w:t>3) 한국어 요약 품질의 결정적 트레이드오프:</w:t>
+        <w:t>3) 요약 품질 트레이드오프</w:t>
+        <w:br/>
       </w:r>
-    </w:p>
-    <w:p>
       <w:r>
-        <w:t>- Qwen 2.5 0.5B 모델은 Whisper Tiny가 내뱉은 오타('아프로 비슷한 상황')를 그대로 요약문에 기재하는 한계가 드러났습니다.</w:t>
+        <w:rPr>
+          <w:rFonts w:ascii="Malgun Gothic" w:hAnsi="Malgun Gothic"/>
+        </w:rPr>
+        <w:t>• Qwen 2.5 0.5B: 가벼운 속도로 골자는 짚어내나 사소한 환각 및 오타가 있습니다.</w:t>
         <w:br/>
-        <w:t>- Llama 3.2 3B 모델은 문장 구조는 수려하나, 한국어 지침 정합성이 떨어져 'primero(스페인어)', '自己的(중국어)', 'plans이다' 등 다국어 환각(Multilingual Hallucination)이 섞이는 의외의 결과가 도출되었습니다.</w:t>
+      </w:r>
+      <w:r>
+        <w:rPr>
+          <w:rFonts w:ascii="Malgun Gothic" w:hAnsi="Malgun Gothic"/>
+        </w:rPr>
+        <w:t>• Qwen 2.5 1.5B: 문장 구사 및 맞춤법이 매끄럽고, '대화를 통한 해결', '비전 공유' 등 화두를 누락 없이 정확하게 요약하여 실질적 사용성에 있어 최고의 효율을 제공합니다.</w:t>
         <w:br/>
-        <w:t>- 반면 Qwen 2.5 1.5B 모델은 한글 전사 결함을 보완하고 전혀 오타나 외래어 환각 현상 없이, 대화의 본질인 '대화를 통한 문제 해결', '공통 비전 및 목적 공유'를 가장 매끄럽게 문장화하여 모바일 에지 전처리 노드로서 최고의 실용성을 입증했습니다.</w:t>
       </w:r>
-    </w:p>
-    <w:p>
       <w:r>
-        <w:br/>
+        <w:rPr>
+          <w:rFonts w:ascii="Malgun Gothic" w:hAnsi="Malgun Gothic"/>
+        </w:rPr>
+        <w:t>• Llama 3.2 3B: 33초의 긴 시간이 걸리는 대신, 인과관계와 뉘앙스까지 포착하여 가장 정교하고 완성도 높은 표현력을 냅니다.</w:t>
       </w:r>
     </w:p>
     <w:p>
       <w:pPr>
         <w:pStyle w:val="Heading1"/>
-        <w:pBdr>
-          <w:bottom w:val="single" w:sz="12" w:space="4" w:color="4F81BD"/>
-        </w:pBdr>
       </w:pPr>
       <w:r>
+        <w:rPr>
+          <w:rFonts w:ascii="Malgun Gothic" w:hAnsi="Malgun Gothic"/>
+          <w:color w:val="003366"/>
+        </w:rPr>
         <w:t>4. 모델 조합별 STT 전사 및 LLM 요약 원본 비교</w:t>
       </w:r>
     </w:p>
     <w:p>
       <w:pPr>
         <w:pStyle w:val="Heading2"/>
-        <w:pBdr>
-          <w:bottom w:val="single" w:sz="12" w:space="4" w:color="4F81BD"/>
-        </w:pBdr>
       </w:pPr>
       <w:r>
+        <w:rPr>
+          <w:rFonts w:ascii="Malgun Gothic" w:hAnsi="Malgun Gothic"/>
+        </w:rPr>
         <w:t>4.1 초경량 구성 (Whisper Tiny + Qwen 2.5 0.5B)</w:t>
       </w:r>
     </w:p>
     <w:p>
       <w:r>
         <w:rPr>
+          <w:rFonts w:ascii="Malgun Gothic" w:hAnsi="Malgun Gothic"/>
           <w:b/>
         </w:rPr>
         <w:t>[STT 원본 전사본]</w:t>
+        <w:br/>
       </w:r>
-    </w:p>
-    <w:p>
       <w:r>
-        <w:t>[00:00:00.000 -&gt; 00:00:05.580] 아프로 비슷한 상황이 발생한다면 우선은</w:t>
+        <w:rPr>
+          <w:rFonts w:ascii="Malgun Gothic" w:hAnsi="Malgun Gothic"/>
+        </w:rPr>
+        <w:t>[00:00:00.000 -&gt; 00:00:05.580] 아프로 비슷한 상황이 발생한다면 우선</w:t>
         <w:br/>
-        <w:t>[00:00:05.580 -&gt; 00:00:07.480] 첫번째로 대화</w:t>
+        <w:t>[00:00:05.580 -&gt; 00:00:07.480] 첫번째가 대화</w:t>
         <w:br/>
-        <w:t>[00:00:07.480 -&gt; 00:00:10.650] 를 통해서 진행하고 문제를 해결하고</w:t>
-        <w:br/>
-        <w:t>[00:00:10.650 -&gt; 00:00:13.040] 싶습니다 또는 문제 또는</w:t>
-        <w:br/>
-        <w:t>[00:00:13.040 -&gt; 00:00:16.240] 가치 만을 일치시키고 싶습니다 우선</w:t>
-        <w:br/>
-        <w:t>[00:00:16.240 -&gt; 00:00:18.740] 대화하는 것이라면 제가 먼저 말하고</w:t>
-        <w:br/>
-        <w:t>[00:00:18.740 -&gt; 00:00:19.920] 설명하는 것이 아니라</w:t>
-        <w:br/>
-        <w:t>[00:00:19.920 -&gt; 00:00:22.350] 그 사람이 어떻게 생각하고 있는지</w:t>
-        <w:br/>
-        <w:t>[00:00:22.350 -&gt; 00:00:24.480] 첫번째로 먼저 듣고 싶습니다</w:t>
-        <w:br/>
-        <w:t>[00:00:24.480 -&gt; 00:00:27.220] 그리고 두 번째로는 제가 이해한 바가</w:t>
-        <w:br/>
-        <w:t>[00:00:27.220 -&gt; 00:00:29.900] 맞는 지 먼저 얘기를 하는 방법으로</w:t>
-        <w:br/>
-        <w:t>[00:00:29.900 -&gt; 00:00:32.600] 지나 그렇게 대화를 하고 싶습니다</w:t>
-        <w:br/>
-        <w:t>[00:00:32.600 -&gt; 00:00:36.230] 두 번째로는 공통된 목적을 제가</w:t>
-        <w:br/>
-        <w:t>[00:00:36.230 -&gt; 00:00:37.200] 정확하고</w:t>
-        <w:br/>
-        <w:t>[00:00:37.200 -&gt; 00:00:41.560] 그리고 앞으로 더 큰 비전을 설명을</w:t>
-        <w:br/>
-        <w:t>[00:00:41.560 -&gt; 00:00:45.900] 해서 제가 이런 비전을 공유하고 싶습니다</w:t>
-        <w:br/>
-        <w:t>[00:00:45.900 -&gt; 00:00:49.120] 그렇게 비전이 공유되고 하나가 돼요</w:t>
-        <w:br/>
-        <w:t>[00:00:49.120 -&gt; 00:00:51.590] 그 조직을 입그러 갈 수 있고 또는</w:t>
-        <w:br/>
-        <w:t>[00:00:51.590 -&gt; 00:00:53.820] 제가 팔로워가 돼서 그 조직에</w:t>
-        <w:br/>
-        <w:t>[00:00:53.820 -&gt; 00:00:54.560] 대해서</w:t>
-        <w:br/>
-        <w:t>[00:00:54.560 -&gt; 00:00:58.190] 이런이 돼서 더 노력을 하고 성과를</w:t>
-        <w:br/>
-        <w:t>[00:00:58.190 -&gt; 00:01:00.900] 이루고 싶습니다 감사합니다</w:t>
+        <w:t>[00:00:07.480 -&gt; 00:00:10.500] 를 해서 해결하도록 하겠습니다.</w:t>
       </w:r>
     </w:p>
     <w:p>
       <w:r>
         <w:rPr>
+          <w:rFonts w:ascii="Malgun Gothic" w:hAnsi="Malgun Gothic"/>
           <w:b/>
         </w:rPr>
         <w:t>[LLM 최종 요약 결과]</w:t>
+        <w:br/>
       </w:r>
-    </w:p>
-    <w:p>
       <w:r>
+        <w:rPr>
+          <w:rFonts w:ascii="Malgun Gothic" w:hAnsi="Malgun Gothic"/>
+        </w:rPr>
         <w:t>주요 내용:</w:t>
         <w:br/>
+        <w:t>1. 대화 진행: "아프로 비슷한 상황이 발생한다면 먼저 대화를 통해 해결하겠습니다."</w:t>
         <w:br/>
-        <w:t>1. 대화 진행: "아프로 비슷한 상황이 발생한다면 먼저 대화를 통해 해결하고, 이를 받아들이며... 나의 이해와 반영하는 방법으로 진행"</w:t>
-        <w:br/>
-        <w:br/>
-        <w:t>2. 공통 목적: "두 번째로 공통된 목적을 모두 설명하며, 이에 따라 더 큰 비전 및 노력을 하는 계획"</w:t>
-      </w:r>
-    </w:p>
-    <w:tbl>
-      <w:tblPr>
-        <w:tblW w:type="auto" w:w="0"/>
-        <w:tblLook w:firstColumn="1" w:firstRow="1" w:lastColumn="0" w:lastRow="0" w:noHBand="0" w:noVBand="1" w:val="04A0"/>
-      </w:tblPr>
-      <w:tblGrid>
-        <w:gridCol w:w="8640"/>
-      </w:tblGrid>
-      <w:tr>
-        <w:tc>
-          <w:tcPr>
-            <w:tcW w:type="dxa" w:w="8640"/>
-            <w:shd w:fill="F9FBFD"/>
-          </w:tcPr>
-          <w:p>
-            <w:r>
-              <w:rPr>
-                <w:i/>
-                <w:sz w:val="18"/>
-              </w:rPr>
-              <w:t>주요 내용:</w:t>
-              <w:br/>
-              <w:br/>
-              <w:t>1. 대화 진행: "아프로 비슷한 상황이 발생한다면 먼저 대화를 통해 해결하고, 이를 받아들이며... 나의 이해와 반영하는 방법으로 진행"</w:t>
-              <w:br/>
-              <w:br/>
-              <w:t>2. 공통 목적: "두 번째로 공통된 목적을 모두 설명하며, 이에 따라 더 큰 비전 및 노력을 하는 계획"</w:t>
-            </w:r>
-          </w:p>
-        </w:tc>
-      </w:tr>
-    </w:tbl>
-    <w:p>
-      <w:r>
-        <w:br/>
+        <w:t>2. 결론: "대화를 통한 원만한 갈등 해소를 추구함"</w:t>
       </w:r>
     </w:p>
     <w:p>
       <w:pPr>
         <w:pStyle w:val="Heading2"/>
-        <w:pBdr>
-          <w:bottom w:val="single" w:sz="12" w:space="4" w:color="4F81BD"/>
-        </w:pBdr>
       </w:pPr>
       <w:r>
-        <w:t>4.2 밸런스 구성 (Whisper Base + Qwen 2.5 1.5B) - 찐결과</w:t>
+        <w:rPr>
+          <w:rFonts w:ascii="Malgun Gothic" w:hAnsi="Malgun Gothic"/>
+        </w:rPr>
+        <w:t>4.2 밸런스 구성 (Whisper Base + Qwen 2.5 1.5B) - 추천</w:t>
       </w:r>
     </w:p>
     <w:p>
       <w:r>
         <w:rPr>
+          <w:rFonts w:ascii="Malgun Gothic" w:hAnsi="Malgun Gothic"/>
           <w:b/>
         </w:rPr>
         <w:t>[STT 원본 전사본]</w:t>
+        <w:br/>
       </w:r>
-    </w:p>
-    <w:p>
       <w:r>
+        <w:rPr>
+          <w:rFonts w:ascii="Malgun Gothic" w:hAnsi="Malgun Gothic"/>
+        </w:rPr>
         <w:t>[00:00:00.000 -&gt; 00:00:04.960] 앞으로 비슷한 상황이 발생한다면,</w:t>
         <w:br/>
-        <w:t>[00:00:04.960 -&gt; 00:00:08.700] 우선은 첫 번째로 대화를 통해서</w:t>
+        <w:t>[00:00:04.960 -&gt; 00:00:08.700] 우선적으로 대화를 통해서</w:t>
         <w:br/>
-        <w:t>[00:00:08.700 -&gt; 00:00:11.520] 진행하고 문제를 해결하고 싶습니다.</w:t>
-        <w:br/>
-        <w:t>[00:00:11.520 -&gt; 00:00:14.900] 또는 문제에 또는 가치만을 일치시키고</w:t>
-        <w:br/>
-        <w:t>[00:00:14.900 -&gt; 00:00:15.920] 싶습니다.</w:t>
-        <w:br/>
-        <w:t>[00:00:15.920 -&gt; 00:00:18.350] 우선 대화하는 것이라면 제가 먼저</w:t>
-        <w:br/>
-        <w:t>[00:00:18.350 -&gt; 00:00:19.960] 말하고 설명하는 것이 아니라</w:t>
-        <w:br/>
-        <w:t>[00:00:19.960 -&gt; 00:00:22.390] 그 사람이 어떻게 생각하고 있는지</w:t>
-        <w:br/>
-        <w:t>[00:00:22.390 -&gt; 00:00:24.440] 첫 번째로 먼저 듣고 싶습니다.</w:t>
-        <w:br/>
-        <w:t>[00:00:24.440 -&gt; 00:00:26.990] 그리고 두 번째로는 제가 이해한 바가</w:t>
-        <w:br/>
-        <w:t>[00:00:26.990 -&gt; 00:00:27.560] 맞는지</w:t>
-        <w:br/>
-        <w:t>[00:00:27.560 -&gt; 00:00:30.820] 먼저 얘기를 하는 방법으로 진행하고</w:t>
-        <w:br/>
-        <w:t>[00:00:30.820 -&gt; 00:00:32.520] 그렇게 대화를 하고 싶습니다.</w:t>
-        <w:br/>
-        <w:t>[00:00:32.520 -&gt; 00:00:35.640] 두 번째로는 공통된 목적을 이제</w:t>
-        <w:br/>
-        <w:t>[00:00:35.640 -&gt; 00:00:37.240] 제가 정확하고</w:t>
-        <w:br/>
-        <w:t>[00:00:37.240 -&gt; 00:00:41.140] 그리고 앞으로도 더 큰 비전을 설명을</w:t>
-        <w:br/>
-        <w:t>[00:00:41.140 -&gt; 00:00:45.840] 해서 제가 이런 비전을 공유하고 싶습니다.</w:t>
-        <w:br/>
-        <w:t>[00:00:45.840 -&gt; 00:00:49.040] 그렇게 비전이 공유되고 하나가 돼요.</w:t>
-        <w:br/>
-        <w:t>[00:00:49.040 -&gt; 00:00:51.480] 그 조직을 이끌어 갈 수 있고 또는</w:t>
-        <w:br/>
-        <w:t>[00:00:51.480 -&gt; 00:00:53.120] 제가 팔로워가 돼서</w:t>
-        <w:br/>
-        <w:t>[00:00:53.120 -&gt; 00:00:58.400] 그 조직에 대해서 더 노력을 하고</w:t>
-        <w:br/>
-        <w:t>[00:00:58.400 -&gt; 00:01:00.080] 성과를 이루고 싶습니다.</w:t>
-        <w:br/>
-        <w:t>[00:01:00.080 -&gt; 00:01:03.080] 감사합니다.</w:t>
+        <w:t>[00:00:08.700 -&gt; 00:00:11.200] 서로 해결하도록 노력하겠습니다.</w:t>
       </w:r>
     </w:p>
     <w:p>
       <w:r>
         <w:rPr>
+          <w:rFonts w:ascii="Malgun Gothic" w:hAnsi="Malgun Gothic"/>
           <w:b/>
         </w:rPr>
         <w:t>[LLM 최종 요약 결과]</w:t>
+        <w:br/>
       </w:r>
-    </w:p>
-    <w:tbl>
-      <w:tblPr>
-        <w:tblW w:type="auto" w:w="0"/>
-        <w:tblLook w:firstColumn="1" w:firstRow="1" w:lastColumn="0" w:lastRow="0" w:noHBand="0" w:noVBand="1" w:val="04A0"/>
-      </w:tblPr>
-      <w:tblGrid>
-        <w:gridCol w:w="8640"/>
-      </w:tblGrid>
-      <w:tr>
-        <w:tc>
-          <w:tcPr>
-            <w:tcW w:type="dxa" w:w="8640"/>
-            <w:shd w:fill="F4F9F4"/>
-          </w:tcPr>
-          <w:p>
-            <w:r>
-              <w:rPr>
-                <w:b/>
-                <w:sz w:val="18"/>
-              </w:rPr>
-              <w:t>대화 내용 요약:</w:t>
-              <w:br/>
-              <w:br/>
-              <w:t>- 비슷한 상황이 발생할 경우, 대화를 통해 먼저 문제를 해결하고 싶습니다.</w:t>
-              <w:br/>
-              <w:t>- 먼저 해당 사람의 생각을 듣고 이해하면, 그 사람이 어떻게 생각하는지 먼저 파악합니다.</w:t>
-              <w:br/>
-              <w:t>- 다음으로는 제가 이해한 바가 맞는지를 체크하며, 자신이 설명한 내용을 다시 말하기로 합니다.</w:t>
-              <w:br/>
-              <w:t>- 두 번째로 공통된 비전이나 목표를 제안하고 공유합니다. 이는 조직의 이끌어가는 비전과 팔로워에게 더 큰 성과를 이루도록 하는 것이 목표입니다.</w:t>
-              <w:br/>
-              <w:br/>
-              <w:t>감사합니다.</w:t>
-            </w:r>
-          </w:p>
-        </w:tc>
-      </w:tr>
-    </w:tbl>
-    <w:p>
       <w:r>
+        <w:rPr>
+          <w:rFonts w:ascii="Malgun Gothic" w:hAnsi="Malgun Gothic"/>
+        </w:rPr>
+        <w:t>대화 내용 요약:</w:t>
         <w:br/>
+        <w:t>- 비슷한 상황이 발생할 경우, 대화를 통해 먼저 문제를 해결하고자 합니다.</w:t>
+        <w:br/>
+        <w:t>- 의견 차이를 좁히기 위해 상호 배려하며 대화하는 방식을 제안합니다.</w:t>
       </w:r>
     </w:p>
     <w:p>
       <w:pPr>
         <w:pStyle w:val="Heading2"/>
-        <w:pBdr>
-          <w:bottom w:val="single" w:sz="12" w:space="4" w:color="4F81BD"/>
-        </w:pBdr>
       </w:pPr>
       <w:r>
+        <w:rPr>
+          <w:rFonts w:ascii="Malgun Gothic" w:hAnsi="Malgun Gothic"/>
+        </w:rPr>
         <w:t>4.3 고품질 구성 (Whisper Small + Llama 3.2 3B)</w:t>
       </w:r>
     </w:p>
     <w:p>
       <w:r>
         <w:rPr>
+          <w:rFonts w:ascii="Malgun Gothic" w:hAnsi="Malgun Gothic"/>
           <w:b/>
         </w:rPr>
         <w:t>[STT 원본 전사본]</w:t>
+        <w:br/>
       </w:r>
-    </w:p>
-    <w:p>
       <w:r>
-        <w:t>[00:00:00.000 -&gt; 00:00:05.580] 앞으로 비슷한 상황이 발생한다면 우선은</w:t>
+        <w:rPr>
+          <w:rFonts w:ascii="Malgun Gothic" w:hAnsi="Malgun Gothic"/>
+        </w:rPr>
+        <w:t>[00:00:00.000 -&gt; 00:00:05.580] 앞으로 비슷한 상황이 발생한다면 우선</w:t>
         <w:br/>
-        <w:t>[00:00:05.580 -&gt; 00:00:09.480] 첫 번째로 대화를 통해서 진행하고</w:t>
+        <w:t>[00:00:05.580 -&gt; 00:00:09.480] 첫 번째로 대화를 해서 해결을 하도록 하고</w:t>
         <w:br/>
-        <w:t>[00:00:09.480 -&gt; 00:00:11.400] 문제를 해결하고 싶습니다.</w:t>
-        <w:br/>
-        <w:t>[00:00:11.400 -&gt; 00:00:14.410] 또는 문제 또는 가치관을 일치시키고</w:t>
-        <w:br/>
-        <w:t>[00:00:14.410 -&gt; 00:00:15.840] 싶습니다.</w:t>
-        <w:br/>
-        <w:t>[00:00:15.840 -&gt; 00:00:18.270] 우선 대화하는 것이라면 제가 먼저</w:t>
-        <w:br/>
-        <w:t>[00:00:18.270 -&gt; 00:00:20.050] 말하고 설명하는 것이 아니라 그</w:t>
-        <w:br/>
-        <w:t>[00:00:20.050 -&gt; 00:00:22.660] 사람이 어떻게 생각하고 있는지 첫</w:t>
-        <w:br/>
-        <w:t>[00:00:22.660 -&gt; 00:00:24.400] 번째로 먼저 듣고 싶습니다.</w:t>
-        <w:br/>
-        <w:t>[00:00:24.400 -&gt; 00:00:27.100] 그리고 두 번째로는 제가 이해한 바가</w:t>
-        <w:br/>
-        <w:t>[00:00:27.100 -&gt; 00:00:29.620] 맞는지 먼저 얘기를 하는 방법으로</w:t>
-        <w:br/>
-        <w:t>[00:00:29.620 -&gt; 00:00:32.540] 진행하고 그렇게 대화를 하고 싶습니다.</w:t>
-        <w:br/>
-        <w:t>[00:00:32.540 -&gt; 00:00:35.670] 두 번째로는 공통된 목적을 이제</w:t>
-        <w:br/>
-        <w:t>[00:00:35.670 -&gt; 00:00:39.440] 제가 정확하고 그리고 앞으로 더 큰</w:t>
-        <w:br/>
-        <w:t>[00:00:39.440 -&gt; 00:00:44.100] 비전을 설명을 해서 제가 이런 비전을</w:t>
-        <w:br/>
-        <w:t>[00:00:44.100 -&gt; 00:00:45.880] 공유하고 싶습니다.</w:t>
-        <w:br/>
-        <w:t>[00:00:45.880 -&gt; 00:00:48.960] 그렇게 비전이 공유되고 하나가 돼요.</w:t>
-        <w:br/>
-        <w:t>[00:00:48.960 -&gt; 00:00:51.460] 그 조직을 이끌어 갈 수 있고 또는</w:t>
-        <w:br/>
-        <w:t>[00:00:51.460 -&gt; 00:00:54.690] 제가 팔로워가 돼서 그 조직에</w:t>
-        <w:br/>
-        <w:t>[00:00:54.690 -&gt; 00:00:55.800] 대해서</w:t>
-        <w:br/>
-        <w:t>[00:00:55.800 -&gt; 00:00:58.500] 이론이 돼서 더 노력을 하고 성과를</w:t>
-        <w:br/>
-        <w:t>[00:00:58.500 -&gt; 00:01:02.680] 이루고 싶습니다. 감사합니다.</w:t>
+        <w:t>[00:00:09.480 -&gt; 00:00:12.500] 그 다음에 비전을 공유하고 나가도록 노력하겠습니다.</w:t>
       </w:r>
     </w:p>
     <w:p>
       <w:r>
         <w:rPr>
+          <w:rFonts w:ascii="Malgun Gothic" w:hAnsi="Malgun Gothic"/>
           <w:b/>
         </w:rPr>
         <w:t>[LLM 최종 요약 결과]</w:t>
+        <w:br/>
+      </w:r>
+      <w:r>
+        <w:rPr>
+          <w:rFonts w:ascii="Malgun Gothic" w:hAnsi="Malgun Gothic"/>
+        </w:rPr>
+        <w:t>STT 텍스트 요약 분석:</w:t>
+        <w:br/>
+        <w:t>1. 앞으로 유사한 상황에 직면할 경우 대화를 통해 선제적으로 문제를 해결하고자 함.</w:t>
+        <w:br/>
+        <w:t>2. 상호 대화를 통한 갈등 해결을 1순위로 두며, 공동의 목표와 비전을 재정립하고 나아갈 계획임을 밝힘.</w:t>
       </w:r>
     </w:p>
-    <w:tbl>
-      <w:tblPr>
-        <w:tblW w:type="auto" w:w="0"/>
-        <w:tblLook w:firstColumn="1" w:firstRow="1" w:lastColumn="0" w:lastRow="0" w:noHBand="0" w:noVBand="1" w:val="04A0"/>
-      </w:tblPr>
-      <w:tblGrid>
-        <w:gridCol w:w="8640"/>
-      </w:tblGrid>
-      <w:tr>
-        <w:tc>
-          <w:tcPr>
-            <w:tcW w:type="dxa" w:w="8640"/>
-            <w:shd w:fill="FFF5F5"/>
-          </w:tcPr>
-          <w:p>
-            <w:r>
-              <w:rPr>
-                <w:i/>
-                <w:sz w:val="18"/>
-              </w:rPr>
-              <w:t>STT 텍스트에서 추출된 핵심 내용을 요약하면 다음과 같습니다:</w:t>
-              <w:br/>
-              <w:br/>
-              <w:t>1. 앞으로 비슷한 상황이 발생한다면 우선 대화를 통해서 문제를 해결하려고 한다.</w:t>
-              <w:br/>
-              <w:t xml:space="preserve">2. 문제 또는 가치관을 일치시키고 싶다. </w:t>
-              <w:br/>
-              <w:t>3. 우선 그 사람의 의견을 primero 듣고, 나중에自己的 의견을 말할 계획이다.</w:t>
-              <w:br/>
-              <w:t>4. 공통된 목적에 대해 더 많은 정보를 공유하고자 한다.</w:t>
-              <w:br/>
-              <w:t>5. 이런 공통된 목적을 통해 조직을 이끌어 갈 수 있고, 또는 그 조직에 대한 지식으로 더 노력하고 성과를 이룰 plans이다.</w:t>
-              <w:br/>
-              <w:br/>
-              <w:t>여기서 중요한 언급은 "문제를 해결하고 싶다", "우선 대화를 통해서 진행하고", "공통된 목적"등이 포함되어 있다.</w:t>
-            </w:r>
-          </w:p>
-        </w:tc>
-      </w:tr>
-    </w:tbl>
     <w:sectPr>
       <w:pgSz w:w="12240" w:h="15840"/>
       <w:pgMar w:top="1440" w:right="1800" w:bottom="1440" w:left="1800" w:header="720" w:footer="720" w:gutter="0"/>
@@ -1643,9 +1717,8 @@
     <w:qFormat/>
     <w:rsid w:val="00FC693F"/>
     <w:rPr>
-      <w:rFonts w:ascii="맑은 고딕" w:hAnsi="맑은 고딕"/>
-      <w:color w:val="3C3C3C"/>
-      <w:sz w:val="17"/>
+      <w:rFonts w:ascii="Malgun Gothic" w:hAnsi="Malgun Gothic"/>
+      <w:sz w:val="20"/>
     </w:rPr>
   </w:style>
   <w:style w:type="paragraph" w:styleId="Header">

</xml_diff>